<commit_message>
Cuenta Bancolombia de Cenova (certificación del 27 oct 2026) en prefacturas, cotizaciones y contrato con cliente
Co-Authored-By: Claude Opus 5.5 <noreply@anthropic.com>
Claude-Session: https://claude.ai/code/session_01HScfFeSLckVpv7MPToSvZW
</commit_message>
<xml_diff>
--- a/web/formatos/CNV-FR-04_Contrato-cliente-servicios-e-instalacion.docx
+++ b/web/formatos/CNV-FR-04_Contrato-cliente-servicios-e-instalacion.docx
@@ -1385,64 +1385,7 @@
           <w:sz w:val="20"/>
           <w:szCs w:val="20"/>
         </w:rPr>
-        <w:t xml:space="preserve">Los pagos se harán a la cuenta </w:t>
-      </w:r>
-      <w:r>
-        <w:rPr>
-          <w:rFonts w:ascii="Arial" w:cs="Arial" w:eastAsia="Arial" w:hAnsi="Arial"/>
-          <w:color w:val="3A4A60"/>
-          <w:sz w:val="20"/>
-          <w:szCs w:val="20"/>
-          <w:shd w:fill="FFF7D6" w:color="auto" w:val="clear"/>
-        </w:rPr>
-        <w:t xml:space="preserve">[tipo]</w:t>
-      </w:r>
-      <w:r>
-        <w:rPr>
-          <w:rFonts w:ascii="Arial" w:cs="Arial" w:eastAsia="Arial" w:hAnsi="Arial"/>
-          <w:color w:val="3A4A60"/>
-          <w:sz w:val="20"/>
-          <w:szCs w:val="20"/>
-        </w:rPr>
-        <w:t xml:space="preserve"> N° </w:t>
-      </w:r>
-      <w:r>
-        <w:rPr>
-          <w:rFonts w:ascii="Arial" w:cs="Arial" w:eastAsia="Arial" w:hAnsi="Arial"/>
-          <w:color w:val="3A4A60"/>
-          <w:sz w:val="20"/>
-          <w:szCs w:val="20"/>
-          <w:shd w:fill="FFF7D6" w:color="auto" w:val="clear"/>
-        </w:rPr>
-        <w:t xml:space="preserve">[número]</w:t>
-      </w:r>
-      <w:r>
-        <w:rPr>
-          <w:rFonts w:ascii="Arial" w:cs="Arial" w:eastAsia="Arial" w:hAnsi="Arial"/>
-          <w:color w:val="3A4A60"/>
-          <w:sz w:val="20"/>
-          <w:szCs w:val="20"/>
-        </w:rPr>
-        <w:t xml:space="preserve"> del banco </w:t>
-      </w:r>
-      <w:r>
-        <w:rPr>
-          <w:rFonts w:ascii="Arial" w:cs="Arial" w:eastAsia="Arial" w:hAnsi="Arial"/>
-          <w:color w:val="3A4A60"/>
-          <w:sz w:val="20"/>
-          <w:szCs w:val="20"/>
-          <w:shd w:fill="FFF7D6" w:color="auto" w:val="clear"/>
-        </w:rPr>
-        <w:t xml:space="preserve">[banco]</w:t>
-      </w:r>
-      <w:r>
-        <w:rPr>
-          <w:rFonts w:ascii="Arial" w:cs="Arial" w:eastAsia="Arial" w:hAnsi="Arial"/>
-          <w:color w:val="3A4A60"/>
-          <w:sz w:val="20"/>
-          <w:szCs w:val="20"/>
-        </w:rPr>
-        <w:t xml:space="preserve"> a nombre de CENOVA S.A.S. Los pagos por pasarela tendrán los descuentos propios de esa plataforma.</w:t>
+        <w:t xml:space="preserve">Los pagos se harán a la cuenta de ahorros Bancolombia N° 78900009256 a nombre de CENOVA S.A.S., NIT 902.114.180-1. Los pagos por pasarela tendrán los descuentos propios de esa plataforma.</w:t>
       </w:r>
     </w:p>
     <w:p>
@@ -2316,8 +2259,32 @@
         <w:szCs w:val="14"/>
       </w:rPr>
       <w:fldChar w:fldCharType="begin"/>
+    </w:r>
+    <w:r>
+      <w:rPr>
+        <w:rFonts w:ascii="Arial" w:cs="Arial" w:eastAsia="Arial" w:hAnsi="Arial"/>
+        <w:color w:val="5B6B80"/>
+        <w:sz w:val="14"/>
+        <w:szCs w:val="14"/>
+      </w:rPr>
       <w:instrText xml:space="preserve">PAGE</w:instrText>
+    </w:r>
+    <w:r>
+      <w:rPr>
+        <w:rFonts w:ascii="Arial" w:cs="Arial" w:eastAsia="Arial" w:hAnsi="Arial"/>
+        <w:color w:val="5B6B80"/>
+        <w:sz w:val="14"/>
+        <w:szCs w:val="14"/>
+      </w:rPr>
       <w:fldChar w:fldCharType="separate"/>
+    </w:r>
+    <w:r>
+      <w:rPr>
+        <w:rFonts w:ascii="Arial" w:cs="Arial" w:eastAsia="Arial" w:hAnsi="Arial"/>
+        <w:color w:val="5B6B80"/>
+        <w:sz w:val="14"/>
+        <w:szCs w:val="14"/>
+      </w:rPr>
       <w:fldChar w:fldCharType="end"/>
     </w:r>
     <w:r>
@@ -2337,8 +2304,32 @@
         <w:szCs w:val="14"/>
       </w:rPr>
       <w:fldChar w:fldCharType="begin"/>
+    </w:r>
+    <w:r>
+      <w:rPr>
+        <w:rFonts w:ascii="Arial" w:cs="Arial" w:eastAsia="Arial" w:hAnsi="Arial"/>
+        <w:color w:val="5B6B80"/>
+        <w:sz w:val="14"/>
+        <w:szCs w:val="14"/>
+      </w:rPr>
       <w:instrText xml:space="preserve">NUMPAGES</w:instrText>
+    </w:r>
+    <w:r>
+      <w:rPr>
+        <w:rFonts w:ascii="Arial" w:cs="Arial" w:eastAsia="Arial" w:hAnsi="Arial"/>
+        <w:color w:val="5B6B80"/>
+        <w:sz w:val="14"/>
+        <w:szCs w:val="14"/>
+      </w:rPr>
       <w:fldChar w:fldCharType="separate"/>
+    </w:r>
+    <w:r>
+      <w:rPr>
+        <w:rFonts w:ascii="Arial" w:cs="Arial" w:eastAsia="Arial" w:hAnsi="Arial"/>
+        <w:color w:val="5B6B80"/>
+        <w:sz w:val="14"/>
+        <w:szCs w:val="14"/>
+      </w:rPr>
       <w:fldChar w:fldCharType="end"/>
     </w:r>
   </w:p>
@@ -2401,7 +2392,7 @@
           <wp:extent cx="1809750" cy="1238250"/>
           <wp:effectExtent t="0" r="0" b="0" l="0"/>
           <wp:wrapNone/>
-          <wp:docPr id="8" name="" descr="" title=""/>
+          <wp:docPr id="8" name=""/>
           <wp:cNvGraphicFramePr>
             <a:graphicFrameLocks xmlns:a="http://schemas.openxmlformats.org/drawingml/2006/main" noChangeAspect="1"/>
           </wp:cNvGraphicFramePr>
@@ -2481,7 +2472,7 @@
               <wp:inline distT="0" distB="0" distL="0" distR="0">
                 <wp:extent cx="419100" cy="323850"/>
                 <wp:effectExtent t="0" r="0" b="0" l="0"/>
-                <wp:docPr id="7" name="" descr="" title=""/>
+                <wp:docPr id="7" name=""/>
                 <wp:cNvGraphicFramePr>
                   <a:graphicFrameLocks xmlns:a="http://schemas.openxmlformats.org/drawingml/2006/main" noChangeAspect="1"/>
                 </wp:cNvGraphicFramePr>
@@ -2831,6 +2822,139 @@
     <w:basedOn w:val="Normal"/>
     <w:qFormat/>
   </w:style>
+  <w:style w:type="paragraph" w:styleId="Caption">
+    <w:name w:val="caption"/>
+    <w:basedOn w:val="Normal"/>
+    <w:next w:val="Normal"/>
+    <w:uiPriority w:val="35"/>
+    <w:semiHidden/>
+    <w:unhideWhenUsed/>
+    <w:qFormat/>
+    <w:pPr>
+      <w:spacing w:after="200"/>
+    </w:pPr>
+    <w:rPr>
+      <w:i/>
+      <w:iCs/>
+      <w:color w:val="44546A" w:themeColor="dark2"/>
+      <w:sz w:val="18"/>
+      <w:szCs w:val="18"/>
+    </w:rPr>
+  </w:style>
+  <w:style w:type="paragraph" w:styleId="Bibliography">
+    <w:name w:val="Bibliography"/>
+    <w:basedOn w:val="Normal"/>
+    <w:next w:val="Normal"/>
+    <w:uiPriority w:val="37"/>
+    <w:unhideWhenUsed/>
+  </w:style>
+  <w:style w:type="paragraph" w:styleId="TOC1">
+    <w:name w:val="toc 1"/>
+    <w:basedOn w:val="Normal"/>
+    <w:next w:val="Normal"/>
+    <w:uiPriority w:val="39"/>
+    <w:semiHidden/>
+    <w:unhideWhenUsed/>
+    <w:pPr>
+      <w:spacing w:after="100"/>
+    </w:pPr>
+  </w:style>
+  <w:style w:type="paragraph" w:styleId="TOC2">
+    <w:name w:val="toc 2"/>
+    <w:basedOn w:val="Normal"/>
+    <w:next w:val="Normal"/>
+    <w:uiPriority w:val="39"/>
+    <w:semiHidden/>
+    <w:unhideWhenUsed/>
+    <w:pPr>
+      <w:spacing w:after="100"/>
+      <w:ind w:left="200"/>
+    </w:pPr>
+  </w:style>
+  <w:style w:type="paragraph" w:styleId="TOC3">
+    <w:name w:val="toc 3"/>
+    <w:basedOn w:val="Normal"/>
+    <w:next w:val="Normal"/>
+    <w:uiPriority w:val="39"/>
+    <w:semiHidden/>
+    <w:unhideWhenUsed/>
+    <w:pPr>
+      <w:spacing w:after="100"/>
+      <w:ind w:left="400"/>
+    </w:pPr>
+  </w:style>
+  <w:style w:type="paragraph" w:styleId="TOC4">
+    <w:name w:val="toc 4"/>
+    <w:basedOn w:val="Normal"/>
+    <w:next w:val="Normal"/>
+    <w:uiPriority w:val="39"/>
+    <w:semiHidden/>
+    <w:unhideWhenUsed/>
+    <w:pPr>
+      <w:spacing w:after="100"/>
+      <w:ind w:left="600"/>
+    </w:pPr>
+  </w:style>
+  <w:style w:type="paragraph" w:styleId="TOC5">
+    <w:name w:val="toc 5"/>
+    <w:basedOn w:val="Normal"/>
+    <w:next w:val="Normal"/>
+    <w:uiPriority w:val="39"/>
+    <w:semiHidden/>
+    <w:unhideWhenUsed/>
+    <w:pPr>
+      <w:spacing w:after="100"/>
+      <w:ind w:left="800"/>
+    </w:pPr>
+  </w:style>
+  <w:style w:type="paragraph" w:styleId="TOC6">
+    <w:name w:val="toc 6"/>
+    <w:basedOn w:val="Normal"/>
+    <w:next w:val="Normal"/>
+    <w:uiPriority w:val="39"/>
+    <w:semiHidden/>
+    <w:unhideWhenUsed/>
+    <w:pPr>
+      <w:spacing w:after="100"/>
+      <w:ind w:left="1000"/>
+    </w:pPr>
+  </w:style>
+  <w:style w:type="paragraph" w:styleId="TOC7">
+    <w:name w:val="toc 7"/>
+    <w:basedOn w:val="Normal"/>
+    <w:next w:val="Normal"/>
+    <w:uiPriority w:val="39"/>
+    <w:semiHidden/>
+    <w:unhideWhenUsed/>
+    <w:pPr>
+      <w:spacing w:after="100"/>
+      <w:ind w:left="1200"/>
+    </w:pPr>
+  </w:style>
+  <w:style w:type="paragraph" w:styleId="TOC8">
+    <w:name w:val="toc 8"/>
+    <w:basedOn w:val="Normal"/>
+    <w:next w:val="Normal"/>
+    <w:uiPriority w:val="39"/>
+    <w:semiHidden/>
+    <w:unhideWhenUsed/>
+    <w:pPr>
+      <w:spacing w:after="100"/>
+      <w:ind w:left="1400"/>
+    </w:pPr>
+  </w:style>
+  <w:style w:type="paragraph" w:styleId="TOC9">
+    <w:name w:val="toc 9"/>
+    <w:basedOn w:val="Normal"/>
+    <w:next w:val="Normal"/>
+    <w:uiPriority w:val="39"/>
+    <w:semiHidden/>
+    <w:unhideWhenUsed/>
+    <w:pPr>
+      <w:spacing w:after="100"/>
+      <w:ind w:left="1600"/>
+    </w:pPr>
+  </w:style>
   <w:style w:type="character" w:styleId="Hyperlink">
     <w:name w:val="Hyperlink"/>
     <w:basedOn w:val="DefaultParagraphFont"/>
@@ -2914,6 +3038,13 @@
       <w:sz w:val="20"/>
       <w:szCs w:val="20"/>
     </w:rPr>
+  </w:style>
+  <w:style w:type="character" w:styleId="LineNumber">
+    <w:name w:val="line number"/>
+    <w:basedOn w:val="DefaultParagraphFont"/>
+    <w:uiPriority w:val="99"/>
+    <w:semiHidden/>
+    <w:unhideWhenUsed/>
   </w:style>
 </w:styles>
 </file>

</xml_diff>